<commit_message>
Take you forward dsa sheet
</commit_message>
<xml_diff>
--- a/link.docx
+++ b/link.docx
@@ -85,19 +85,7 @@
           <w:rPr>
             <w:rStyle w:val="Hyperlink"/>
           </w:rPr>
-          <w:t>http://10.</w:t>
-        </w:r>
-        <w:r>
-          <w:rPr>
-            <w:rStyle w:val="Hyperlink"/>
-          </w:rPr>
-          <w:t>1</w:t>
-        </w:r>
-        <w:r>
-          <w:rPr>
-            <w:rStyle w:val="Hyperlink"/>
-          </w:rPr>
-          <w:t>6.100.244/</w:t>
+          <w:t>http://10.16.100.244/</w:t>
         </w:r>
       </w:hyperlink>
       <w:r>
@@ -124,6 +112,14 @@
       </w:r>
       <w:r>
         <w:t xml:space="preserve">  </w:t>
+      </w:r>
+    </w:p>
+    <w:p>
+      <w:r>
+        <w:t xml:space="preserve">7. Take you forward Indian youtuber sheets for DSA =&gt;  </w:t>
+      </w:r>
+      <w:r>
+        <w:t>https://takeuforward.org/home</w:t>
       </w:r>
     </w:p>
     <w:sectPr>

</xml_diff>